<commit_message>
rev6: update docx with orchestration prompt; update journal
Co-Authored-By: Claude Sonnet 4.6 <noreply@anthropic.com>
</commit_message>
<xml_diff>
--- a/.Improvements/Rev 6/Claude REV 6.docx
+++ b/.Improvements/Rev 6/Claude REV 6.docx
@@ -14,13 +14,34 @@
       <w:r>
         <w:t xml:space="preserve"> </w:t>
       </w:r>
-      <w:r>
-        <w:t>hey we did run the plan but i forgot to update the journal. can you explore the code base and advise if this did or did not occur?</w:t>
-      </w:r>
-    </w:p>
-    <w:p>
-      <w:r>
-        <w:t>/grill-me</w:t>
+      <w:proofErr w:type="gramStart"/>
+      <w:r>
+        <w:t>hey</w:t>
+      </w:r>
+      <w:proofErr w:type="gramEnd"/>
+      <w:r>
+        <w:t xml:space="preserve"> we did run the plan but </w:t>
+      </w:r>
+      <w:proofErr w:type="spellStart"/>
+      <w:r>
+        <w:t>i</w:t>
+      </w:r>
+      <w:proofErr w:type="spellEnd"/>
+      <w:r>
+        <w:t xml:space="preserve"> forgot to update the journal. can you explore the code base and advise if this did or did not occur?</w:t>
+      </w:r>
+    </w:p>
+    <w:p>
+      <w:r>
+        <w:t>/</w:t>
+      </w:r>
+      <w:proofErr w:type="gramStart"/>
+      <w:r>
+        <w:t>grill</w:t>
+      </w:r>
+      <w:proofErr w:type="gramEnd"/>
+      <w:r>
+        <w:t>-me</w:t>
       </w:r>
       <w:r>
         <w:t xml:space="preserve"> </w:t>
@@ -53,7 +74,23 @@
         <w:t xml:space="preserve"> flange</w:t>
       </w:r>
       <w:r>
-        <w:t>. currently i think it applies the intermediate restraints as top and bottom (ie as if it is a haunch).</w:t>
+        <w:t xml:space="preserve">. currently </w:t>
+      </w:r>
+      <w:proofErr w:type="spellStart"/>
+      <w:r>
+        <w:t>i</w:t>
+      </w:r>
+      <w:proofErr w:type="spellEnd"/>
+      <w:r>
+        <w:t xml:space="preserve"> think it applies the intermediate restraints as top and bottom (</w:t>
+      </w:r>
+      <w:proofErr w:type="spellStart"/>
+      <w:r>
+        <w:t>ie</w:t>
+      </w:r>
+      <w:proofErr w:type="spellEnd"/>
+      <w:r>
+        <w:t xml:space="preserve"> as if it is a haunch).</w:t>
       </w:r>
       <w:r>
         <w:t xml:space="preserve"> </w:t>
@@ -71,79 +108,15 @@
         </w:numPr>
       </w:pPr>
       <w:r>
-        <w:t xml:space="preserve">Add a new tab called </w:t>
-      </w:r>
-      <w:r>
-        <w:t xml:space="preserve">Steel </w:t>
-      </w:r>
-      <w:r>
-        <w:t>brace</w:t>
-      </w:r>
-      <w:r>
-        <w:t xml:space="preserve">, the application page will be able to design a </w:t>
-      </w:r>
-      <w:r>
-        <w:t xml:space="preserve">horizontal </w:t>
-      </w:r>
-      <w:r>
-        <w:t xml:space="preserve">steel </w:t>
-      </w:r>
-      <w:r>
-        <w:t>brace</w:t>
-      </w:r>
-      <w:r>
-        <w:t xml:space="preserve"> in accordance with AS4100. It will have a similar layout to steel beam but the geometry input will be span. Loads will be similar with G</w:t>
-      </w:r>
-      <w:r>
-        <w:t xml:space="preserve">, </w:t>
-      </w:r>
-      <w:r>
-        <w:t xml:space="preserve">Q </w:t>
-      </w:r>
-      <w:r>
-        <w:t>and wind loads.</w:t>
-      </w:r>
-      <w:r>
-        <w:t xml:space="preserve"> the load input will be a via point load. </w:t>
-      </w:r>
-      <w:r>
-        <w:t xml:space="preserve">Add an option to enter a maximum axial ultimate load as a point load. </w:t>
-      </w:r>
-      <w:r>
-        <w:t xml:space="preserve">A section for x and </w:t>
-      </w:r>
-      <w:r>
-        <w:t>y effective length</w:t>
-      </w:r>
-      <w:r>
-        <w:t>. There will be sections to choose from</w:t>
-      </w:r>
-      <w:r>
-        <w:t xml:space="preserve"> including CHS, </w:t>
-      </w:r>
-      <w:r>
-        <w:t xml:space="preserve">SHS and RHS grades 250, 350 and 450 will be available. The same auto lightest button will still be there under the section size location. The output will be a graph showing combine axial and </w:t>
-      </w:r>
-      <w:r>
-        <w:t xml:space="preserve">vertical </w:t>
-      </w:r>
-      <w:r>
-        <w:t>bending</w:t>
-      </w:r>
-      <w:r>
-        <w:t xml:space="preserve"> from the sections self-weight</w:t>
-      </w:r>
-      <w:r>
-        <w:t xml:space="preserve"> against the chosen </w:t>
-      </w:r>
-      <w:r>
-        <w:t>section’s</w:t>
-      </w:r>
-      <w:r>
-        <w:t xml:space="preserve"> capacity. The export PDF will also still be there with a summary, graphs and calculations in accordance with AS4100</w:t>
-      </w:r>
-      <w:r>
-        <w:t>.</w:t>
+        <w:t xml:space="preserve">Add a new tab called Steel brace, the application page will be able to design a horizontal steel brace in accordance with AS4100. It will have a similar layout to steel </w:t>
+      </w:r>
+      <w:proofErr w:type="gramStart"/>
+      <w:r>
+        <w:t>beam</w:t>
+      </w:r>
+      <w:proofErr w:type="gramEnd"/>
+      <w:r>
+        <w:t xml:space="preserve"> but the geometry input will be span. Loads will be similar with G, Q and wind loads. the load input will be a via point load. Add an option to enter a maximum axial ultimate load as a point load. A section for x and y effective length. There will be sections to choose from including CHS, SHS and RHS grades 250, 350 and 450 will be available. The same auto lightest button will still be there under the section size location. The output will be a graph showing combine axial and vertical bending from the sections self-weight against the chosen section’s capacity. The export PDF will also still be there with a summary, graphs and calculations in accordance with AS4100.</w:t>
       </w:r>
     </w:p>
     <w:p>
@@ -170,7 +143,15 @@
         </w:numPr>
       </w:pPr>
       <w:r>
-        <w:t xml:space="preserve">Change the grey text colour to white for all three tab tools.  </w:t>
+        <w:t xml:space="preserve">Change the grey text colour to white for all </w:t>
+      </w:r>
+      <w:proofErr w:type="gramStart"/>
+      <w:r>
+        <w:t>three tab</w:t>
+      </w:r>
+      <w:proofErr w:type="gramEnd"/>
+      <w:r>
+        <w:t xml:space="preserve"> tools.  </w:t>
       </w:r>
       <w:r>
         <w:t>"C:\Users\socoo\.projects\01 Steel Beam\.Improvements\Rev 6\3.jpg"</w:t>
@@ -235,10 +216,34 @@
         <w:t>6</w:t>
       </w:r>
       <w:r>
-        <w:t>\HANDOVER.md"</w:t>
-      </w:r>
-      <w:r>
-        <w:t xml:space="preserve">  read document, design orchestration. use existing kanban to lodge and track progress. include a critic and validator subagent role to confirm the issues were resolved correctly. confirmation must use browser mcp to visually confirm issues resolved in addition to your requirements. update  the journal file and save the plan to the project directory. do not execute the plan in this context.</w:t>
+        <w:t>\HANDOVER.md</w:t>
+      </w:r>
+      <w:proofErr w:type="gramStart"/>
+      <w:r>
+        <w:t>"</w:t>
+      </w:r>
+      <w:r>
+        <w:t xml:space="preserve">  read</w:t>
+      </w:r>
+      <w:proofErr w:type="gramEnd"/>
+      <w:r>
+        <w:t xml:space="preserve"> document, design orchestration. use existing kanban to lodge and track progress. include a critic and validator subagent role to confirm the issues were resolved correctly. confirmation must use browser </w:t>
+      </w:r>
+      <w:proofErr w:type="spellStart"/>
+      <w:r>
+        <w:t>mcp</w:t>
+      </w:r>
+      <w:proofErr w:type="spellEnd"/>
+      <w:r>
+        <w:t xml:space="preserve"> to visually confirm issues resolved in addition to your requirements. </w:t>
+      </w:r>
+      <w:proofErr w:type="gramStart"/>
+      <w:r>
+        <w:t>update  the</w:t>
+      </w:r>
+      <w:proofErr w:type="gramEnd"/>
+      <w:r>
+        <w:t xml:space="preserve"> journal file and save the plan to the project directory. do not execute the plan in this context.</w:t>
       </w:r>
     </w:p>
     <w:p>
@@ -285,6 +290,12 @@
     <w:p>
       <w:r>
         <w:t>Update journal</w:t>
+      </w:r>
+    </w:p>
+    <w:p/>
+    <w:p>
+      <w:r>
+        <w:t>Handover read document, design orchestration. Use existing kanban to lodge and track progress. Include a critic and validator subagent role to confirm the issues were resolved in addition to your requirements. Update the journal file and save the plan to the project directory. Do not execute the plan in this context.</w:t>
       </w:r>
     </w:p>
     <w:p>

</xml_diff>